<commit_message>
Add a fourth Loom script on how the model was improved after it tied naive
Covers the diagnostic sequence a panel will ask about once they have seen the
result: measuring direction separately from magnitude (cos +0.57 is what turned
an unexplained failure into a specific one), the calibration that follows from
it, the constant-velocity target that raises the floor, the overfitting fix, and
the two rival explanations eliminated by measurement rather than assumption.

Also frames the earlier rounds -- absolute-to-residual, DATA_SCALE, adaptive
smoothing, horizon conditioning -- as the same method applied before, so the
process reads as repeatable rather than as one lucky fix.

Segment timings are derived from the actual word counts rather than estimated;
this script runs ~7 minutes against ~5 for the other three, and the recording
guidance now says so.

Co-Authored-By: Claude Opus 5 <noreply@anthropic.com>
</commit_message>
<xml_diff>
--- a/Module5_6_Loom_Scripts.docx
+++ b/Module5_6_Loom_Scripts.docx
@@ -216,7 +216,7 @@
       </w:pPr>
       <w:r>
         <w:rPr/>
-        <w:t xml:space="preserve">Aim for five minutes. Record in two or three takes and keep the best. </w:t>
+        <w:t xml:space="preserve">Aim for five minutes for Scripts 1 to 3; Script 4 runs closer to seven, since it covers the full diagnostic sequence. Record in two or three takes and keep the best. </w:t>
       </w:r>
     </w:p>
     <w:p>
@@ -2706,7 +2706,7 @@
       </w:pPr>
       <w:r>
         <w:rPr/>
-        <w:t>Recording Order and Continuity</w:t>
+        <w:t>Script 4 — Improving the Model After It Failed to Beat the Baseline</w:t>
       </w:r>
     </w:p>
     <w:p>
@@ -2717,8 +2717,855 @@
         <w:rPr/>
       </w:pPr>
       <w:r>
-        <w:rPr/>
-        <w:t>Record in the order Ahmad, Shehroz, Humair. Each script ends by naming the next person, so the three videos play as one sequence. If you are submitting a single combined video, keep those handover lines; if the three are submitted separately, each member should add one sentence at the start stating which project and which module they are covering.</w:t>
+        <w:rPr>
+          <w:rStyle w:val="Strong"/>
+        </w:rPr>
+        <w:t>Presented by Ahmad</w:t>
+      </w:r>
+      <w:r>
+        <w:rPr/>
+        <w:t xml:space="preserve">, or split with Shehroz taking segments 3 and 7 if you prefer a two-voice video. Record this </w:t>
+      </w:r>
+      <w:r>
+        <w:rPr>
+          <w:rStyle w:val="Emphasis"/>
+        </w:rPr>
+        <w:t>after</w:t>
+      </w:r>
+      <w:r>
+        <w:rPr/>
+        <w:t xml:space="preserve"> the other three; it assumes the viewer has seen the result and answers the obvious follow-up question: what did you do about it?</w:t>
+      </w:r>
+    </w:p>
+    <w:tbl>
+      <w:tblPr>
+        <w:tblW w:w="10539" w:type="dxa"/>
+        <w:jc w:val="left"/>
+        <w:tblInd w:w="28" w:type="dxa"/>
+        <w:tblLayout w:type="fixed"/>
+        <w:tblCellMar>
+          <w:top w:w="28" w:type="dxa"/>
+          <w:left w:w="28" w:type="dxa"/>
+          <w:bottom w:w="28" w:type="dxa"/>
+          <w:right w:w="28" w:type="dxa"/>
+        </w:tblCellMar>
+      </w:tblPr>
+      <w:tblGrid>
+        <w:gridCol w:w="583"/>
+        <w:gridCol w:w="4056"/>
+        <w:gridCol w:w="5900"/>
+      </w:tblGrid>
+      <w:tr>
+        <w:trPr/>
+        <w:tc>
+          <w:tcPr>
+            <w:tcW w:w="583" w:type="dxa"/>
+            <w:tcBorders/>
+            <w:vAlign w:val="center"/>
+          </w:tcPr>
+          <w:p>
+            <w:pPr>
+              <w:pStyle w:val="TableHeading"/>
+              <w:bidi w:val="0"/>
+              <w:ind w:hanging="0" w:left="0" w:right="0"/>
+              <w:jc w:val="left"/>
+              <w:rPr/>
+            </w:pPr>
+            <w:r>
+              <w:rPr/>
+              <w:t>Time</w:t>
+            </w:r>
+          </w:p>
+        </w:tc>
+        <w:tc>
+          <w:tcPr>
+            <w:tcW w:w="4056" w:type="dxa"/>
+            <w:tcBorders/>
+            <w:vAlign w:val="center"/>
+          </w:tcPr>
+          <w:p>
+            <w:pPr>
+              <w:pStyle w:val="TableHeading"/>
+              <w:suppressLineNumbers/>
+              <w:shd w:fill="DCE3E3" w:val="clear"/>
+              <w:bidi w:val="0"/>
+              <w:spacing w:lineRule="auto" w:line="274"/>
+              <w:jc w:val="left"/>
+              <w:rPr/>
+            </w:pPr>
+            <w:r>
+              <w:rPr/>
+              <w:t>On screen</w:t>
+            </w:r>
+          </w:p>
+        </w:tc>
+        <w:tc>
+          <w:tcPr>
+            <w:tcW w:w="5900" w:type="dxa"/>
+            <w:tcBorders/>
+            <w:vAlign w:val="center"/>
+          </w:tcPr>
+          <w:p>
+            <w:pPr>
+              <w:pStyle w:val="TableHeading"/>
+              <w:suppressLineNumbers/>
+              <w:shd w:fill="DCE3E3" w:val="clear"/>
+              <w:bidi w:val="0"/>
+              <w:spacing w:lineRule="auto" w:line="274"/>
+              <w:jc w:val="left"/>
+              <w:rPr/>
+            </w:pPr>
+            <w:r>
+              <w:rPr/>
+              <w:t>What you say</w:t>
+            </w:r>
+          </w:p>
+        </w:tc>
+      </w:tr>
+      <w:tr>
+        <w:trPr/>
+        <w:tc>
+          <w:tcPr>
+            <w:tcW w:w="583" w:type="dxa"/>
+            <w:tcBorders/>
+            <w:vAlign w:val="center"/>
+          </w:tcPr>
+          <w:p>
+            <w:pPr>
+              <w:pStyle w:val="TableContents"/>
+              <w:widowControl w:val="false"/>
+              <w:suppressLineNumbers/>
+              <w:bidi w:val="0"/>
+              <w:spacing w:lineRule="auto" w:line="274"/>
+              <w:jc w:val="left"/>
+              <w:rPr/>
+            </w:pPr>
+            <w:r>
+              <w:rPr/>
+              <w:t>0:00</w:t>
+              <w:br/>
+              <w:t>0:32</w:t>
+            </w:r>
+          </w:p>
+        </w:tc>
+        <w:tc>
+          <w:tcPr>
+            <w:tcW w:w="4056" w:type="dxa"/>
+            <w:tcBorders/>
+            <w:vAlign w:val="center"/>
+          </w:tcPr>
+          <w:p>
+            <w:pPr>
+              <w:pStyle w:val="TableContents"/>
+              <w:bidi w:val="0"/>
+              <w:ind w:hanging="0" w:left="0" w:right="0"/>
+              <w:jc w:val="left"/>
+              <w:rPr/>
+            </w:pPr>
+            <w:r>
+              <w:rPr>
+                <w:rStyle w:val="SourceText"/>
+              </w:rPr>
+              <w:t>module5_qa.png</w:t>
+            </w:r>
+            <w:r>
+              <w:rPr/>
+              <w:t>, middle panel — the red line above the grey</w:t>
+            </w:r>
+          </w:p>
+        </w:tc>
+        <w:tc>
+          <w:tcPr>
+            <w:tcW w:w="5900" w:type="dxa"/>
+            <w:tcBorders/>
+            <w:vAlign w:val="center"/>
+          </w:tcPr>
+          <w:p>
+            <w:pPr>
+              <w:pStyle w:val="TableContents"/>
+              <w:bidi w:val="0"/>
+              <w:jc w:val="left"/>
+              <w:rPr>
+                <w:i/>
+              </w:rPr>
+            </w:pPr>
+            <w:r>
+              <w:rPr>
+                <w:i/>
+              </w:rPr>
+              <w:t>This is where we were. Our model's error, in red, never drops below the grey line — a baseline that just assumes nothing moves. 0.01568 against 0.01557. So the obvious question is what we did about it, and that is what this video covers. The short version is that we refused to guess. Every change we made came from a measurement that told us where the problem actually was.</w:t>
+            </w:r>
+          </w:p>
+        </w:tc>
+      </w:tr>
+      <w:tr>
+        <w:trPr/>
+        <w:tc>
+          <w:tcPr>
+            <w:tcW w:w="583" w:type="dxa"/>
+            <w:tcBorders/>
+            <w:vAlign w:val="center"/>
+          </w:tcPr>
+          <w:p>
+            <w:pPr>
+              <w:pStyle w:val="TableContents"/>
+              <w:widowControl w:val="false"/>
+              <w:suppressLineNumbers/>
+              <w:bidi w:val="0"/>
+              <w:spacing w:lineRule="auto" w:line="274"/>
+              <w:jc w:val="left"/>
+              <w:rPr/>
+            </w:pPr>
+            <w:r>
+              <w:rPr/>
+              <w:t>0:32</w:t>
+              <w:br/>
+              <w:t>1:38</w:t>
+            </w:r>
+          </w:p>
+        </w:tc>
+        <w:tc>
+          <w:tcPr>
+            <w:tcW w:w="4056" w:type="dxa"/>
+            <w:tcBorders/>
+            <w:vAlign w:val="center"/>
+          </w:tcPr>
+          <w:p>
+            <w:pPr>
+              <w:pStyle w:val="TableContents"/>
+              <w:bidi w:val="0"/>
+              <w:ind w:hanging="0" w:left="0" w:right="0"/>
+              <w:jc w:val="left"/>
+              <w:rPr/>
+            </w:pPr>
+            <w:r>
+              <w:rPr/>
+              <w:t>Cell 36, scroll slowly through the CONFIG comment blocks</w:t>
+            </w:r>
+          </w:p>
+        </w:tc>
+        <w:tc>
+          <w:tcPr>
+            <w:tcW w:w="5900" w:type="dxa"/>
+            <w:tcBorders/>
+            <w:vAlign w:val="center"/>
+          </w:tcPr>
+          <w:p>
+            <w:pPr>
+              <w:pStyle w:val="TableContents"/>
+              <w:bidi w:val="0"/>
+              <w:jc w:val="left"/>
+              <w:rPr>
+                <w:i/>
+              </w:rPr>
+            </w:pPr>
+            <w:r>
+              <w:rPr>
+                <w:i/>
+              </w:rPr>
+              <w:t>It is worth saying this was not the first time. The first version predicted absolute positions and scored a Chamfer Distance of 2.3 against a baseline of 0.0005 — it failed completely, so we changed it to predict movement instead of position. Then the movement turned out to be four thousandths of a unit, far smaller than the noise the model adds during training, so we rescaled it. Then we found the raw tracked motion had almost no consistency frame to frame — a correlation of 0.077 — so we added smoothing upstream, which took it to 0.89. Then we found the model was being asked to predict one, two and three frames ahead without being told which, so we gave it the horizon as an input. Each of those came from a measurement, and this round was the same process.</w:t>
+            </w:r>
+          </w:p>
+        </w:tc>
+      </w:tr>
+      <w:tr>
+        <w:trPr/>
+        <w:tc>
+          <w:tcPr>
+            <w:tcW w:w="583" w:type="dxa"/>
+            <w:tcBorders/>
+            <w:vAlign w:val="center"/>
+          </w:tcPr>
+          <w:p>
+            <w:pPr>
+              <w:pStyle w:val="TableContents"/>
+              <w:widowControl w:val="false"/>
+              <w:suppressLineNumbers/>
+              <w:bidi w:val="0"/>
+              <w:spacing w:lineRule="auto" w:line="274"/>
+              <w:jc w:val="left"/>
+              <w:rPr/>
+            </w:pPr>
+            <w:r>
+              <w:rPr/>
+              <w:t>1:38</w:t>
+              <w:br/>
+              <w:t>2:30</w:t>
+            </w:r>
+          </w:p>
+        </w:tc>
+        <w:tc>
+          <w:tcPr>
+            <w:tcW w:w="4056" w:type="dxa"/>
+            <w:tcBorders/>
+            <w:vAlign w:val="center"/>
+          </w:tcPr>
+          <w:p>
+            <w:pPr>
+              <w:pStyle w:val="TableContents"/>
+              <w:bidi w:val="0"/>
+              <w:ind w:hanging="0" w:left="0" w:right="0"/>
+              <w:jc w:val="left"/>
+              <w:rPr/>
+            </w:pPr>
+            <w:r>
+              <w:rPr/>
+              <w:t>Side-by-side figure, the "predicted motion ×20" column, cosine values visible</w:t>
+            </w:r>
+          </w:p>
+        </w:tc>
+        <w:tc>
+          <w:tcPr>
+            <w:tcW w:w="5900" w:type="dxa"/>
+            <w:tcBorders/>
+            <w:vAlign w:val="center"/>
+          </w:tcPr>
+          <w:p>
+            <w:pPr>
+              <w:pStyle w:val="TableContents"/>
+              <w:bidi w:val="0"/>
+              <w:jc w:val="left"/>
+              <w:rPr>
+                <w:i/>
+              </w:rPr>
+            </w:pPr>
+            <w:r>
+              <w:rPr>
+                <w:i/>
+              </w:rPr>
+              <w:t>Technique one, and the most important: we stopped looking at the score and started looking at the prediction itself. Chamfer Distance is a single number, and it cannot tell the difference between a model that has learned nothing and a model that has learned which way the tissue moves but not how far. So we measured those two things separately. The direction agreement is plus 0.57 one frame ahead. A model that had learned nothing would sit near zero. So the model does know which way the tissue is going — the size of the movement is what is wrong. That one measurement changed the problem from unexplained to specific.</w:t>
+            </w:r>
+          </w:p>
+        </w:tc>
+      </w:tr>
+      <w:tr>
+        <w:trPr/>
+        <w:tc>
+          <w:tcPr>
+            <w:tcW w:w="583" w:type="dxa"/>
+            <w:tcBorders/>
+            <w:vAlign w:val="center"/>
+          </w:tcPr>
+          <w:p>
+            <w:pPr>
+              <w:pStyle w:val="TableContents"/>
+              <w:widowControl w:val="false"/>
+              <w:suppressLineNumbers/>
+              <w:bidi w:val="0"/>
+              <w:spacing w:lineRule="auto" w:line="274"/>
+              <w:jc w:val="left"/>
+              <w:rPr/>
+            </w:pPr>
+            <w:r>
+              <w:rPr/>
+              <w:t>2:30</w:t>
+              <w:br/>
+              <w:t>3:25</w:t>
+            </w:r>
+          </w:p>
+        </w:tc>
+        <w:tc>
+          <w:tcPr>
+            <w:tcW w:w="4056" w:type="dxa"/>
+            <w:tcBorders/>
+            <w:vAlign w:val="center"/>
+          </w:tcPr>
+          <w:p>
+            <w:pPr>
+              <w:pStyle w:val="TableContents"/>
+              <w:bidi w:val="0"/>
+              <w:ind w:hanging="0" w:left="0" w:right="0"/>
+              <w:jc w:val="left"/>
+              <w:rPr/>
+            </w:pPr>
+            <w:r>
+              <w:rPr/>
+              <w:t>Cell 42, the CALIBRATION section comment block</w:t>
+            </w:r>
+          </w:p>
+        </w:tc>
+        <w:tc>
+          <w:tcPr>
+            <w:tcW w:w="5900" w:type="dxa"/>
+            <w:tcBorders/>
+            <w:vAlign w:val="center"/>
+          </w:tcPr>
+          <w:p>
+            <w:pPr>
+              <w:pStyle w:val="TableContents"/>
+              <w:bidi w:val="0"/>
+              <w:jc w:val="left"/>
+              <w:rPr>
+                <w:i/>
+              </w:rPr>
+            </w:pPr>
+            <w:r>
+              <w:rPr>
+                <w:i/>
+              </w:rPr>
+              <w:t>Technique two follows directly. If the direction is right and only the size is wrong, then multiplying the prediction by a single number should fix it. And this is not wishful thinking — it is provable. The best possible scalar leaves an error of one minus the squared direction correlation, which means any real directional signal at all is enough to beat the baseline once the size is corrected. At the correlation we measured, that is about eight percent better than assuming nothing moves. The important detail is that we fit that number on training frames only, never on the frames we report results on. Fitting it on the test data would guarantee an improvement that means nothing.</w:t>
+            </w:r>
+          </w:p>
+        </w:tc>
+      </w:tr>
+      <w:tr>
+        <w:trPr/>
+        <w:tc>
+          <w:tcPr>
+            <w:tcW w:w="583" w:type="dxa"/>
+            <w:tcBorders/>
+            <w:vAlign w:val="center"/>
+          </w:tcPr>
+          <w:p>
+            <w:pPr>
+              <w:pStyle w:val="TableContents"/>
+              <w:widowControl w:val="false"/>
+              <w:suppressLineNumbers/>
+              <w:bidi w:val="0"/>
+              <w:spacing w:lineRule="auto" w:line="274"/>
+              <w:jc w:val="left"/>
+              <w:rPr/>
+            </w:pPr>
+            <w:r>
+              <w:rPr/>
+              <w:t>3:25</w:t>
+              <w:br/>
+              <w:t>4:22</w:t>
+            </w:r>
+          </w:p>
+        </w:tc>
+        <w:tc>
+          <w:tcPr>
+            <w:tcW w:w="4056" w:type="dxa"/>
+            <w:tcBorders/>
+            <w:vAlign w:val="center"/>
+          </w:tcPr>
+          <w:p>
+            <w:pPr>
+              <w:pStyle w:val="TableContents"/>
+              <w:bidi w:val="0"/>
+              <w:ind w:hanging="0" w:left="0" w:right="0"/>
+              <w:jc w:val="left"/>
+              <w:rPr/>
+            </w:pPr>
+            <w:r>
+              <w:rPr/>
+              <w:t xml:space="preserve">Cell 36, the </w:t>
+            </w:r>
+            <w:r>
+              <w:rPr>
+                <w:rStyle w:val="SourceText"/>
+              </w:rPr>
+              <w:t>TARGET_MODE</w:t>
+            </w:r>
+            <w:r>
+              <w:rPr/>
+              <w:t xml:space="preserve"> block, then QT1 panel showing the blue line</w:t>
+            </w:r>
+          </w:p>
+        </w:tc>
+        <w:tc>
+          <w:tcPr>
+            <w:tcW w:w="5900" w:type="dxa"/>
+            <w:tcBorders/>
+            <w:vAlign w:val="center"/>
+          </w:tcPr>
+          <w:p>
+            <w:pPr>
+              <w:pStyle w:val="TableContents"/>
+              <w:bidi w:val="0"/>
+              <w:jc w:val="left"/>
+              <w:rPr>
+                <w:i/>
+              </w:rPr>
+            </w:pPr>
+            <w:r>
+              <w:rPr>
+                <w:i/>
+              </w:rPr>
+              <w:t>Technique three is a change to what the model is asked to predict at all. Look at the blue line here — that is just assuming the tissue keeps moving in a straight line, and it beats the grey baseline by 41 percent. Now, under our old setup, a model that gives up and predicts nothing lands exactly on the grey line, and that is effectively what ours did. So we changed the target: the model now predicts only the correction to that straight-line guess. If it gives up now, it lands on the blue line instead. We raised the floor rather than chasing the ceiling, and everything the model does learn is spent on the part straight-line motion cannot explain.</w:t>
+            </w:r>
+          </w:p>
+        </w:tc>
+      </w:tr>
+      <w:tr>
+        <w:trPr/>
+        <w:tc>
+          <w:tcPr>
+            <w:tcW w:w="583" w:type="dxa"/>
+            <w:tcBorders/>
+            <w:vAlign w:val="center"/>
+          </w:tcPr>
+          <w:p>
+            <w:pPr>
+              <w:pStyle w:val="TableContents"/>
+              <w:widowControl w:val="false"/>
+              <w:suppressLineNumbers/>
+              <w:bidi w:val="0"/>
+              <w:spacing w:lineRule="auto" w:line="274"/>
+              <w:jc w:val="left"/>
+              <w:rPr/>
+            </w:pPr>
+            <w:r>
+              <w:rPr/>
+              <w:t>4:22</w:t>
+              <w:br/>
+              <w:t>5:05</w:t>
+            </w:r>
+          </w:p>
+        </w:tc>
+        <w:tc>
+          <w:tcPr>
+            <w:tcW w:w="4056" w:type="dxa"/>
+            <w:tcBorders/>
+            <w:vAlign w:val="center"/>
+          </w:tcPr>
+          <w:p>
+            <w:pPr>
+              <w:pStyle w:val="TableContents"/>
+              <w:bidi w:val="0"/>
+              <w:ind w:hanging="0" w:left="0" w:right="0"/>
+              <w:jc w:val="left"/>
+              <w:rPr/>
+            </w:pPr>
+            <w:r>
+              <w:rPr>
+                <w:rStyle w:val="SourceText"/>
+              </w:rPr>
+              <w:t>module5_qa.png</w:t>
+            </w:r>
+            <w:r>
+              <w:rPr/>
+              <w:t>, left and middle panels together</w:t>
+            </w:r>
+          </w:p>
+        </w:tc>
+        <w:tc>
+          <w:tcPr>
+            <w:tcW w:w="5900" w:type="dxa"/>
+            <w:tcBorders/>
+            <w:vAlign w:val="center"/>
+          </w:tcPr>
+          <w:p>
+            <w:pPr>
+              <w:pStyle w:val="TableContents"/>
+              <w:bidi w:val="0"/>
+              <w:jc w:val="left"/>
+              <w:rPr>
+                <w:i/>
+              </w:rPr>
+            </w:pPr>
+            <w:r>
+              <w:rPr>
+                <w:i/>
+              </w:rPr>
+              <w:t>Technique four is about how long we train. Look at these two together: on the left the training loss keeps falling all the way to epoch 500, but in the middle the validation error bottoms out around epoch 60 and then climbs. That gap is overfitting, and it means roughly four hundred of those five hundred epochs were making the model worse. So we cut training to 200 epochs and increased regularisation fivefold. We also keep the best-validating checkpoint automatically, so the final model is never worse than the best one we saw.</w:t>
+            </w:r>
+          </w:p>
+        </w:tc>
+      </w:tr>
+      <w:tr>
+        <w:trPr/>
+        <w:tc>
+          <w:tcPr>
+            <w:tcW w:w="583" w:type="dxa"/>
+            <w:tcBorders/>
+            <w:vAlign w:val="center"/>
+          </w:tcPr>
+          <w:p>
+            <w:pPr>
+              <w:pStyle w:val="TableContents"/>
+              <w:widowControl w:val="false"/>
+              <w:suppressLineNumbers/>
+              <w:bidi w:val="0"/>
+              <w:spacing w:lineRule="auto" w:line="274"/>
+              <w:jc w:val="left"/>
+              <w:rPr/>
+            </w:pPr>
+            <w:r>
+              <w:rPr/>
+              <w:t>5:05</w:t>
+              <w:br/>
+              <w:t>5:54</w:t>
+            </w:r>
+          </w:p>
+        </w:tc>
+        <w:tc>
+          <w:tcPr>
+            <w:tcW w:w="4056" w:type="dxa"/>
+            <w:tcBorders/>
+            <w:vAlign w:val="center"/>
+          </w:tcPr>
+          <w:p>
+            <w:pPr>
+              <w:pStyle w:val="TableContents"/>
+              <w:bidi w:val="0"/>
+              <w:ind w:hanging="0" w:left="0" w:right="0"/>
+              <w:jc w:val="left"/>
+              <w:rPr/>
+            </w:pPr>
+            <w:r>
+              <w:rPr>
+                <w:rStyle w:val="SourceText"/>
+              </w:rPr>
+              <w:t>module6_timeline_diagnostics.png</w:t>
+            </w:r>
+            <w:r>
+              <w:rPr/>
+              <w:t xml:space="preserve"> — the left and right charts</w:t>
+            </w:r>
+          </w:p>
+        </w:tc>
+        <w:tc>
+          <w:tcPr>
+            <w:tcW w:w="5900" w:type="dxa"/>
+            <w:tcBorders/>
+            <w:vAlign w:val="center"/>
+          </w:tcPr>
+          <w:p>
+            <w:pPr>
+              <w:pStyle w:val="TableContents"/>
+              <w:bidi w:val="0"/>
+              <w:jc w:val="left"/>
+              <w:rPr>
+                <w:i/>
+              </w:rPr>
+            </w:pPr>
+            <w:r>
+              <w:rPr>
+                <w:i/>
+              </w:rPr>
+              <w:t>Technique five is the one people skip: ruling things out. We had two plausible theories. The first was that the model gets worse the further it predicts from the data it learned on — we tested it, correlation 0.02, not significant, so no. The second was that our preprocessing throws away blurry frames, which would make the motion between frames uneven and corrupt what the model learns — we recovered the original frame timing and tested that too, and across 333 test points no frames had been dropped. Both theories were wrong, and knowing that stopped us spending weeks fixing things that were not broken.</w:t>
+            </w:r>
+          </w:p>
+        </w:tc>
+      </w:tr>
+      <w:tr>
+        <w:trPr/>
+        <w:tc>
+          <w:tcPr>
+            <w:tcW w:w="583" w:type="dxa"/>
+            <w:tcBorders/>
+            <w:vAlign w:val="center"/>
+          </w:tcPr>
+          <w:p>
+            <w:pPr>
+              <w:pStyle w:val="TableContents"/>
+              <w:widowControl w:val="false"/>
+              <w:suppressLineNumbers/>
+              <w:bidi w:val="0"/>
+              <w:spacing w:lineRule="auto" w:line="274"/>
+              <w:jc w:val="left"/>
+              <w:rPr/>
+            </w:pPr>
+            <w:r>
+              <w:rPr/>
+              <w:t>5:54</w:t>
+              <w:br/>
+              <w:t>6:59</w:t>
+            </w:r>
+          </w:p>
+        </w:tc>
+        <w:tc>
+          <w:tcPr>
+            <w:tcW w:w="4056" w:type="dxa"/>
+            <w:tcBorders/>
+            <w:vAlign w:val="center"/>
+          </w:tcPr>
+          <w:p>
+            <w:pPr>
+              <w:pStyle w:val="TableContents"/>
+              <w:bidi w:val="0"/>
+              <w:ind w:hanging="0" w:left="0" w:right="0"/>
+              <w:jc w:val="left"/>
+              <w:rPr/>
+            </w:pPr>
+            <w:r>
+              <w:rPr/>
+              <w:t xml:space="preserve">Cell 36 config, briefly on </w:t>
+            </w:r>
+            <w:r>
+              <w:rPr>
+                <w:rStyle w:val="SourceText"/>
+              </w:rPr>
+              <w:t>WINDOW_SIZE</w:t>
+            </w:r>
+            <w:r>
+              <w:rPr/>
+              <w:t>; then the Module 6 heading</w:t>
+            </w:r>
+          </w:p>
+        </w:tc>
+        <w:tc>
+          <w:tcPr>
+            <w:tcW w:w="5900" w:type="dxa"/>
+            <w:tcBorders/>
+            <w:vAlign w:val="center"/>
+          </w:tcPr>
+          <w:p>
+            <w:pPr>
+              <w:pStyle w:val="TableContents"/>
+              <w:bidi w:val="0"/>
+              <w:jc w:val="left"/>
+              <w:rPr>
+                <w:i/>
+              </w:rPr>
+            </w:pPr>
+            <w:r>
+              <w:rPr>
+                <w:i/>
+              </w:rPr>
+              <w:t>Two things we considered but have not done yet. The first is showing the model more history — it currently sees four frames. It is worth testing, but we do not think it is the limit right now, because the model is not using the four frames it already has; it collapsed to predicting almost no motion. The second, and more important, is holding out an entire video for testing. Right now we pick our best model and report results on the same frames, which makes our numbers slightly generous, and we say so. So: we have a model that knows which way tissue moves, two fixes aimed exactly at what we measured to be wrong, and two wrong theories eliminated. That is the state we are in, and the next run tells us whether the fixes land.</w:t>
+            </w:r>
+          </w:p>
+        </w:tc>
+      </w:tr>
+    </w:tbl>
+    <w:p>
+      <w:pPr>
+        <w:pStyle w:val="Heading3"/>
+        <w:bidi w:val="0"/>
+        <w:jc w:val="left"/>
+        <w:rPr/>
+      </w:pPr>
+      <w:r>
+        <w:rPr/>
+        <w:t>If the panel asks</w:t>
+      </w:r>
+    </w:p>
+    <w:p>
+      <w:pPr>
+        <w:pStyle w:val="BodyText"/>
+        <w:numPr>
+          <w:ilvl w:val="0"/>
+          <w:numId w:val="5"/>
+        </w:numPr>
+        <w:tabs>
+          <w:tab w:val="clear" w:pos="709"/>
+          <w:tab w:val="left" w:pos="709" w:leader="none"/>
+        </w:tabs>
+        <w:bidi w:val="0"/>
+        <w:spacing w:before="0" w:after="0"/>
+        <w:ind w:hanging="283" w:left="709"/>
+        <w:jc w:val="left"/>
+        <w:rPr/>
+      </w:pPr>
+      <w:r>
+        <w:rPr>
+          <w:rStyle w:val="Strong"/>
+        </w:rPr>
+        <w:t>Why not just train longer, or on more data?</w:t>
+      </w:r>
+      <w:r>
+        <w:rPr/>
+        <w:t xml:space="preserve"> Training longer was making it worse — that is what the overfitting measurement shows. More data would help, but we measured that the failure is magnitude, not lack of signal, so more data alone would not address it. </w:t>
+      </w:r>
+    </w:p>
+    <w:p>
+      <w:pPr>
+        <w:pStyle w:val="BodyText"/>
+        <w:numPr>
+          <w:ilvl w:val="0"/>
+          <w:numId w:val="5"/>
+        </w:numPr>
+        <w:tabs>
+          <w:tab w:val="clear" w:pos="709"/>
+          <w:tab w:val="left" w:pos="709" w:leader="none"/>
+        </w:tabs>
+        <w:bidi w:val="0"/>
+        <w:spacing w:before="0" w:after="0"/>
+        <w:ind w:hanging="283" w:left="709"/>
+        <w:jc w:val="left"/>
+        <w:rPr/>
+      </w:pPr>
+      <w:r>
+        <w:rPr>
+          <w:rStyle w:val="Strong"/>
+        </w:rPr>
+        <w:t>Isn't changing the target just making the baseline do your work?</w:t>
+      </w:r>
+      <w:r>
+        <w:rPr/>
+        <w:t xml:space="preserve"> Partly, and deliberately. A predictive system should never be worse than a trivial estimator. This guarantees that, and the model is still judged on whether it improves on it. </w:t>
+      </w:r>
+    </w:p>
+    <w:p>
+      <w:pPr>
+        <w:pStyle w:val="BodyText"/>
+        <w:numPr>
+          <w:ilvl w:val="0"/>
+          <w:numId w:val="5"/>
+        </w:numPr>
+        <w:tabs>
+          <w:tab w:val="clear" w:pos="709"/>
+          <w:tab w:val="left" w:pos="709" w:leader="none"/>
+        </w:tabs>
+        <w:bidi w:val="0"/>
+        <w:spacing w:before="0" w:after="0"/>
+        <w:ind w:hanging="283" w:left="709"/>
+        <w:jc w:val="left"/>
+        <w:rPr/>
+      </w:pPr>
+      <w:r>
+        <w:rPr>
+          <w:rStyle w:val="Strong"/>
+        </w:rPr>
+        <w:t>Would a wider context window help?</w:t>
+      </w:r>
+      <w:r>
+        <w:rPr/>
+        <w:t xml:space="preserve"> Possibly, and it is cheap to test, but the model is not yet using the context it has. Our upstream measurements also show velocity is well estimated from two smoothed frames, so extra frames mostly buy acceleration. </w:t>
+      </w:r>
+    </w:p>
+    <w:p>
+      <w:pPr>
+        <w:pStyle w:val="BodyText"/>
+        <w:numPr>
+          <w:ilvl w:val="0"/>
+          <w:numId w:val="5"/>
+        </w:numPr>
+        <w:tabs>
+          <w:tab w:val="clear" w:pos="709"/>
+          <w:tab w:val="left" w:pos="709" w:leader="none"/>
+        </w:tabs>
+        <w:bidi w:val="0"/>
+        <w:ind w:hanging="283" w:left="709"/>
+        <w:jc w:val="left"/>
+        <w:rPr/>
+      </w:pPr>
+      <w:r>
+        <w:rPr>
+          <w:rStyle w:val="Strong"/>
+        </w:rPr>
+        <w:t>What if the fixes don't work?</w:t>
+      </w:r>
+      <w:r>
+        <w:rPr/>
+        <w:t xml:space="preserve"> Then the calibration result still holds, because it is mathematically guaranteed given a non-zero direction correlation, and we would have evidence that the remaining error is not something inference-time correction can reach. </w:t>
+      </w:r>
+    </w:p>
+    <w:p>
+      <w:pPr>
+        <w:pStyle w:val="Heading2"/>
+        <w:bidi w:val="0"/>
+        <w:jc w:val="left"/>
+        <w:rPr/>
+      </w:pPr>
+      <w:r>
+        <w:rPr/>
+        <w:t>Recording Order and Continuity</w:t>
+      </w:r>
+    </w:p>
+    <w:p>
+      <w:pPr>
+        <w:pStyle w:val="BodyText"/>
+        <w:bidi w:val="0"/>
+        <w:jc w:val="left"/>
+        <w:rPr/>
+      </w:pPr>
+      <w:r>
+        <w:rPr/>
+        <w:t>Record in the order Ahmad, Shehroz, Humair, then Script 4 last. Each of the first three ends by naming the next person, so they play as one sequence; Script 4 stands alone and answers the question the first three provoke. If you are submitting a single combined video, keep those handover lines; if the three are submitted separately, each member should add one sentence at the start stating which project and which module they are covering.</w:t>
       </w:r>
     </w:p>
     <w:p>
@@ -3299,6 +4146,143 @@
   <w:abstractNum w:abstractNumId="5">
     <w:lvl w:ilvl="0">
       <w:start w:val="1"/>
+      <w:numFmt w:val="bullet"/>
+      <w:lvlText w:val=""/>
+      <w:lvlJc w:val="left"/>
+      <w:pPr>
+        <w:tabs>
+          <w:tab w:val="num" w:pos="709"/>
+        </w:tabs>
+        <w:ind w:left="709" w:hanging="283"/>
+      </w:pPr>
+      <w:rPr>
+        <w:rFonts w:ascii="Symbol" w:hAnsi="Symbol" w:cs="Symbol" w:hint="default"/>
+      </w:rPr>
+    </w:lvl>
+    <w:lvl w:ilvl="1">
+      <w:start w:val="1"/>
+      <w:numFmt w:val="bullet"/>
+      <w:lvlText w:val=""/>
+      <w:lvlJc w:val="left"/>
+      <w:pPr>
+        <w:tabs>
+          <w:tab w:val="num" w:pos="1418"/>
+        </w:tabs>
+        <w:ind w:left="1418" w:hanging="283"/>
+      </w:pPr>
+      <w:rPr>
+        <w:rFonts w:ascii="Symbol" w:hAnsi="Symbol" w:cs="Symbol" w:hint="default"/>
+      </w:rPr>
+    </w:lvl>
+    <w:lvl w:ilvl="2">
+      <w:start w:val="1"/>
+      <w:numFmt w:val="bullet"/>
+      <w:lvlText w:val=""/>
+      <w:lvlJc w:val="left"/>
+      <w:pPr>
+        <w:tabs>
+          <w:tab w:val="num" w:pos="2127"/>
+        </w:tabs>
+        <w:ind w:left="2127" w:hanging="283"/>
+      </w:pPr>
+      <w:rPr>
+        <w:rFonts w:ascii="Symbol" w:hAnsi="Symbol" w:cs="Symbol" w:hint="default"/>
+      </w:rPr>
+    </w:lvl>
+    <w:lvl w:ilvl="3">
+      <w:start w:val="1"/>
+      <w:numFmt w:val="bullet"/>
+      <w:lvlText w:val=""/>
+      <w:lvlJc w:val="left"/>
+      <w:pPr>
+        <w:tabs>
+          <w:tab w:val="num" w:pos="2836"/>
+        </w:tabs>
+        <w:ind w:left="2836" w:hanging="283"/>
+      </w:pPr>
+      <w:rPr>
+        <w:rFonts w:ascii="Symbol" w:hAnsi="Symbol" w:cs="Symbol" w:hint="default"/>
+      </w:rPr>
+    </w:lvl>
+    <w:lvl w:ilvl="4">
+      <w:start w:val="1"/>
+      <w:numFmt w:val="bullet"/>
+      <w:lvlText w:val=""/>
+      <w:lvlJc w:val="left"/>
+      <w:pPr>
+        <w:tabs>
+          <w:tab w:val="num" w:pos="3545"/>
+        </w:tabs>
+        <w:ind w:left="3545" w:hanging="283"/>
+      </w:pPr>
+      <w:rPr>
+        <w:rFonts w:ascii="Symbol" w:hAnsi="Symbol" w:cs="Symbol" w:hint="default"/>
+      </w:rPr>
+    </w:lvl>
+    <w:lvl w:ilvl="5">
+      <w:start w:val="1"/>
+      <w:numFmt w:val="bullet"/>
+      <w:lvlText w:val=""/>
+      <w:lvlJc w:val="left"/>
+      <w:pPr>
+        <w:tabs>
+          <w:tab w:val="num" w:pos="4254"/>
+        </w:tabs>
+        <w:ind w:left="4254" w:hanging="283"/>
+      </w:pPr>
+      <w:rPr>
+        <w:rFonts w:ascii="Symbol" w:hAnsi="Symbol" w:cs="Symbol" w:hint="default"/>
+      </w:rPr>
+    </w:lvl>
+    <w:lvl w:ilvl="6">
+      <w:start w:val="1"/>
+      <w:numFmt w:val="bullet"/>
+      <w:lvlText w:val=""/>
+      <w:lvlJc w:val="left"/>
+      <w:pPr>
+        <w:tabs>
+          <w:tab w:val="num" w:pos="4963"/>
+        </w:tabs>
+        <w:ind w:left="4963" w:hanging="283"/>
+      </w:pPr>
+      <w:rPr>
+        <w:rFonts w:ascii="Symbol" w:hAnsi="Symbol" w:cs="Symbol" w:hint="default"/>
+      </w:rPr>
+    </w:lvl>
+    <w:lvl w:ilvl="7">
+      <w:start w:val="1"/>
+      <w:numFmt w:val="bullet"/>
+      <w:lvlText w:val=""/>
+      <w:lvlJc w:val="left"/>
+      <w:pPr>
+        <w:tabs>
+          <w:tab w:val="num" w:pos="5672"/>
+        </w:tabs>
+        <w:ind w:left="5672" w:hanging="283"/>
+      </w:pPr>
+      <w:rPr>
+        <w:rFonts w:ascii="Symbol" w:hAnsi="Symbol" w:cs="Symbol" w:hint="default"/>
+      </w:rPr>
+    </w:lvl>
+    <w:lvl w:ilvl="8">
+      <w:start w:val="1"/>
+      <w:numFmt w:val="bullet"/>
+      <w:lvlText w:val=""/>
+      <w:lvlJc w:val="left"/>
+      <w:pPr>
+        <w:tabs>
+          <w:tab w:val="num" w:pos="6381"/>
+        </w:tabs>
+        <w:ind w:left="6381" w:hanging="283"/>
+      </w:pPr>
+      <w:rPr>
+        <w:rFonts w:ascii="Symbol" w:hAnsi="Symbol" w:cs="Symbol" w:hint="default"/>
+      </w:rPr>
+    </w:lvl>
+  </w:abstractNum>
+  <w:abstractNum w:abstractNumId="6">
+    <w:lvl w:ilvl="0">
+      <w:start w:val="1"/>
       <w:numFmt w:val="none"/>
       <w:pStyle w:val="Heading1"/>
       <w:suff w:val="nothing"/>
@@ -3432,6 +4416,9 @@
   </w:num>
   <w:num w:numId="5">
     <w:abstractNumId w:val="5"/>
+  </w:num>
+  <w:num w:numId="6">
+    <w:abstractNumId w:val="6"/>
   </w:num>
 </w:numbering>
 </file>
@@ -3542,6 +4529,14 @@
     <w:qFormat/>
     <w:rPr>
       <w:rFonts w:ascii="OpenSymbol" w:hAnsi="OpenSymbol" w:eastAsia="OpenSymbol" w:cs="OpenSymbol"/>
+    </w:rPr>
+  </w:style>
+  <w:style w:type="character" w:styleId="Emphasis">
+    <w:name w:val="Emphasis"/>
+    <w:qFormat/>
+    <w:rPr>
+      <w:i/>
+      <w:iCs/>
     </w:rPr>
   </w:style>
   <w:style w:type="paragraph" w:styleId="Heading">

</xml_diff>